<commit_message>
added BPMN for To-Be process in To-Be process document with a comaprision table of As-Is and To-Be
</commit_message>
<xml_diff>
--- a/03As Is Process Documentation.docx
+++ b/03As Is Process Documentation.docx
@@ -1527,7 +1527,7 @@
           <w:p>
             <w:pPr>
               <w:pStyle w:val="ListParagraph"/>
-              <w:spacing w:line="5" w:lineRule="atLeast"/>
+              <w:spacing w:line="60" w:lineRule="auto"/>
               <w:ind w:left="0" w:right="-142"/>
               <w:rPr>
                 <w:rFonts w:ascii="Times New Roman" w:hAnsi="Times New Roman" w:cs="Times New Roman"/>
@@ -1561,7 +1561,7 @@
           <w:p>
             <w:pPr>
               <w:pStyle w:val="ListParagraph"/>
-              <w:spacing w:line="5" w:lineRule="atLeast"/>
+              <w:spacing w:line="60" w:lineRule="auto"/>
               <w:ind w:left="0" w:right="-142"/>
               <w:rPr>
                 <w:rFonts w:ascii="Times New Roman" w:hAnsi="Times New Roman" w:cs="Times New Roman"/>
@@ -1595,7 +1595,7 @@
           <w:p>
             <w:pPr>
               <w:pStyle w:val="ListParagraph"/>
-              <w:spacing w:line="5" w:lineRule="atLeast"/>
+              <w:spacing w:line="60" w:lineRule="auto"/>
               <w:ind w:left="0" w:right="-142"/>
               <w:rPr>
                 <w:rFonts w:ascii="Times New Roman" w:hAnsi="Times New Roman" w:cs="Times New Roman"/>
@@ -1629,7 +1629,7 @@
           <w:p>
             <w:pPr>
               <w:pStyle w:val="ListParagraph"/>
-              <w:spacing w:line="5" w:lineRule="atLeast"/>
+              <w:spacing w:line="60" w:lineRule="auto"/>
               <w:ind w:left="0" w:right="-142"/>
               <w:rPr>
                 <w:rFonts w:ascii="Times New Roman" w:hAnsi="Times New Roman" w:cs="Times New Roman"/>
@@ -1677,6 +1677,54 @@
                 <w:rFonts w:ascii="Times New Roman" w:hAnsi="Times New Roman" w:cs="Times New Roman"/>
               </w:rPr>
               <w:t>Issue/Pain Point</w:t>
+            </w:r>
+          </w:p>
+        </w:tc>
+      </w:tr>
+      <w:tr>
+        <w:tc>
+          <w:tcPr>
+            <w:cnfStyle w:val="001000000000" w:firstRow="0" w:lastRow="0" w:firstColumn="1" w:lastColumn="0" w:oddVBand="0" w:evenVBand="0" w:oddHBand="0" w:evenHBand="0" w:firstRowFirstColumn="0" w:firstRowLastColumn="0" w:lastRowFirstColumn="0" w:lastRowLastColumn="0"/>
+            <w:tcW w:w="1543" w:type="dxa"/>
+          </w:tcPr>
+          <w:p>
+            <w:pPr>
+              <w:pStyle w:val="ListParagraph"/>
+              <w:spacing w:line="5" w:lineRule="atLeast"/>
+              <w:ind w:left="0" w:right="-142"/>
+              <w:rPr>
+                <w:rFonts w:ascii="Times New Roman" w:hAnsi="Times New Roman" w:cs="Times New Roman"/>
+                <w:color w:val="000000" w:themeColor="text1"/>
+              </w:rPr>
+            </w:pPr>
+            <w:r>
+              <w:rPr>
+                <w:rFonts w:ascii="Segoe UI Symbol" w:hAnsi="Segoe UI Symbol" w:cs="Segoe UI Symbol"/>
+                <w:color w:val="000000" w:themeColor="text1"/>
+              </w:rPr>
+              <w:t>⬤</w:t>
+            </w:r>
+          </w:p>
+        </w:tc>
+        <w:tc>
+          <w:tcPr>
+            <w:tcW w:w="2421" w:type="dxa"/>
+          </w:tcPr>
+          <w:p>
+            <w:pPr>
+              <w:pStyle w:val="ListParagraph"/>
+              <w:spacing w:line="15" w:lineRule="atLeast"/>
+              <w:ind w:left="0" w:right="-144"/>
+              <w:cnfStyle w:val="000000000000" w:firstRow="0" w:lastRow="0" w:firstColumn="0" w:lastColumn="0" w:oddVBand="0" w:evenVBand="0" w:oddHBand="0" w:evenHBand="0" w:firstRowFirstColumn="0" w:firstRowLastColumn="0" w:lastRowFirstColumn="0" w:lastRowLastColumn="0"/>
+              <w:rPr>
+                <w:rFonts w:ascii="Times New Roman" w:hAnsi="Times New Roman" w:cs="Times New Roman"/>
+              </w:rPr>
+            </w:pPr>
+            <w:r>
+              <w:rPr>
+                <w:rFonts w:ascii="Times New Roman" w:hAnsi="Times New Roman" w:cs="Times New Roman"/>
+              </w:rPr>
+              <w:t>End</w:t>
             </w:r>
           </w:p>
         </w:tc>
@@ -2518,7 +2566,6 @@
   <w:style w:type="character" w:default="1" w:styleId="DefaultParagraphFont">
     <w:name w:val="Default Paragraph Font"/>
     <w:uiPriority w:val="1"/>
-    <w:semiHidden/>
     <w:unhideWhenUsed/>
   </w:style>
   <w:style w:type="table" w:default="1" w:styleId="TableNormal">

</xml_diff>